<commit_message>
Update all 3 CVs with latest changes
</commit_message>
<xml_diff>
--- a/my_cv/Chinedu_Agwunobi_CE_CV.docx
+++ b/my_cv/Chinedu_Agwunobi_CE_CV.docx
@@ -62,9 +62,37 @@
         <w:rPr>
           <w:rFonts w:ascii="Times" w:eastAsia="Times" w:hAnsi="Times" w:cs="Times"/>
         </w:rPr>
-        <w:t xml:space="preserve"> | </w:t>
+        <w:t xml:space="preserve"> |</w:t>
+      </w:r>
+      <w:r>
+        <w:rPr>
+          <w:rFonts w:ascii="Times" w:eastAsia="Times" w:hAnsi="Times" w:cs="Times"/>
+        </w:rPr>
+        <w:t xml:space="preserve"> </w:t>
       </w:r>
       <w:hyperlink r:id="rId7" w:history="1">
+        <w:r>
+          <w:rPr>
+            <w:rStyle w:val="Hyperlink"/>
+            <w:rFonts w:ascii="Times" w:eastAsia="Times" w:hAnsi="Times" w:cs="Times"/>
+            <w:color w:val="0070C0"/>
+          </w:rPr>
+          <w:t>Website</w:t>
+        </w:r>
+      </w:hyperlink>
+      <w:r>
+        <w:rPr>
+          <w:rFonts w:ascii="Times" w:eastAsia="Times" w:hAnsi="Times" w:cs="Times"/>
+        </w:rPr>
+        <w:t xml:space="preserve"> |</w:t>
+      </w:r>
+      <w:r>
+        <w:rPr>
+          <w:rFonts w:ascii="Times" w:eastAsia="Times" w:hAnsi="Times" w:cs="Times"/>
+        </w:rPr>
+        <w:t xml:space="preserve"> </w:t>
+      </w:r>
+      <w:hyperlink r:id="rId8" w:history="1">
         <w:r>
           <w:rPr>
             <w:rStyle w:val="Hyperlink"/>
@@ -86,7 +114,7 @@
         </w:rPr>
         <w:t xml:space="preserve">| </w:t>
       </w:r>
-      <w:hyperlink r:id="rId8" w:history="1">
+      <w:hyperlink r:id="rId9" w:history="1">
         <w:r>
           <w:rPr>
             <w:rStyle w:val="Hyperlink"/>
@@ -102,7 +130,7 @@
         </w:rPr>
         <w:t xml:space="preserve"> | </w:t>
       </w:r>
-      <w:hyperlink r:id="rId9" w:history="1">
+      <w:hyperlink r:id="rId10" w:history="1">
         <w:r>
           <w:rPr>
             <w:rStyle w:val="Hyperlink"/>
@@ -1258,7 +1286,7 @@
               </w:rPr>
               <w:t xml:space="preserve"> | </w:t>
             </w:r>
-            <w:hyperlink r:id="rId10" w:history="1">
+            <w:hyperlink r:id="rId11" w:history="1">
               <w:r>
                 <w:rPr>
                   <w:rStyle w:val="Hyperlink"/>
@@ -1432,7 +1460,7 @@
               </w:rPr>
               <w:t xml:space="preserve">| </w:t>
             </w:r>
-            <w:hyperlink r:id="rId11" w:history="1">
+            <w:hyperlink r:id="rId12" w:history="1">
               <w:r>
                 <w:rPr>
                   <w:rStyle w:val="Hyperlink"/>
@@ -1561,7 +1589,7 @@
               </w:rPr>
               <w:t xml:space="preserve"> | </w:t>
             </w:r>
-            <w:hyperlink r:id="rId12" w:history="1">
+            <w:hyperlink r:id="rId13" w:history="1">
               <w:r>
                 <w:rPr>
                   <w:rStyle w:val="Hyperlink"/>
@@ -1664,7 +1692,7 @@
               </w:rPr>
               <w:t xml:space="preserve">| </w:t>
             </w:r>
-            <w:hyperlink r:id="rId13" w:history="1">
+            <w:hyperlink r:id="rId14" w:history="1">
               <w:r>
                 <w:rPr>
                   <w:rStyle w:val="Hyperlink"/>
@@ -1767,7 +1795,7 @@
               </w:rPr>
               <w:t xml:space="preserve"> | </w:t>
             </w:r>
-            <w:hyperlink r:id="rId14" w:history="1">
+            <w:hyperlink r:id="rId15" w:history="1">
               <w:r>
                 <w:rPr>
                   <w:rStyle w:val="Hyperlink"/>
@@ -2404,9 +2432,9 @@
     </w:p>
     <w:p/>
     <w:sectPr>
-      <w:headerReference w:type="default" r:id="rId15"/>
-      <w:footerReference w:type="default" r:id="rId16"/>
-      <w:headerReference w:type="first" r:id="rId17"/>
+      <w:headerReference w:type="default" r:id="rId16"/>
+      <w:footerReference w:type="default" r:id="rId17"/>
+      <w:headerReference w:type="first" r:id="rId18"/>
       <w:pgSz w:w="12240" w:h="15840"/>
       <w:pgMar w:top="720" w:right="720" w:bottom="720" w:left="720" w:header="0" w:footer="0" w:gutter="0"/>
       <w:pgNumType w:start="1"/>
@@ -3559,6 +3587,18 @@
       <w:u w:val="single"/>
     </w:rPr>
   </w:style>
+  <w:style w:type="character" w:styleId="UnresolvedMention">
+    <w:name w:val="Unresolved Mention"/>
+    <w:basedOn w:val="DefaultParagraphFont"/>
+    <w:uiPriority w:val="99"/>
+    <w:semiHidden/>
+    <w:unhideWhenUsed/>
+    <w:rsid w:val="0045208E"/>
+    <w:rPr>
+      <w:color w:val="605E5C"/>
+      <w:shd w:val="clear" w:color="auto" w:fill="E1DFDD"/>
+    </w:rPr>
+  </w:style>
 </w:styles>
 </file>
 

</xml_diff>